<commit_message>
delete: Atualiza artigo científico com novas informações e ajustes
</commit_message>
<xml_diff>
--- a/article/PGP_ARTIGO.docx
+++ b/article/PGP_ARTIGO.docx
@@ -1,6 +1,6 @@
 
 <file path=word/document.xml><?xml version="1.0" encoding="utf-8"?>
-<w:document xmlns:r="http://schemas.openxmlformats.org/officeDocument/2006/relationships" xmlns:wp="http://schemas.openxmlformats.org/drawingml/2006/wordprocessingDrawing" xmlns:w="http://schemas.openxmlformats.org/wordprocessingml/2006/main" xmlns:w10="urn:schemas-microsoft-com:office:word" xmlns:w14="http://schemas.microsoft.com/office/word/2010/wordml" xmlns:wps="http://schemas.microsoft.com/office/word/2010/wordprocessingShape" xmlns:wpg="http://schemas.microsoft.com/office/word/2010/wordprocessingGroup" xmlns:mc="http://schemas.openxmlformats.org/markup-compatibility/2006" xmlns:v="urn:schemas-microsoft-com:vml" xmlns:o="urn:schemas-microsoft-com:office:office" xmlns:m="http://schemas.openxmlformats.org/officeDocument/2006/math" mc:Ignorable="w14">
+<w:document xmlns:ns1="http://schemas.openxmlformats.org/markup-compatibility/2006" xmlns:ns2="http://schemas.openxmlformats.org/officeDocument/2006/relationships" xmlns:w="http://schemas.openxmlformats.org/wordprocessingml/2006/main" ns1:Ignorable="w14">
   <w:body>
     <w:p>
       <w:pPr>
@@ -221,287 +221,287 @@
           <w:rtl w:val="0"/>
           <w:lang w:val="pt-PT"/>
         </w:rPr>
-        <w:t>Os acidentes de tr</w:t>
-      </w:r>
-      <w:r>
-        <w:rPr>
-          <w:rtl w:val="0"/>
-          <w:lang w:val="pt-PT"/>
-        </w:rPr>
-        <w:t>â</w:t>
-      </w:r>
-      <w:r>
-        <w:rPr>
-          <w:rtl w:val="0"/>
-          <w:lang w:val="pt-PT"/>
-        </w:rPr>
-        <w:t>nsito nas rodovias federais de Santa Catarina representam um grave problema socioecon</w:t>
-      </w:r>
-      <w:r>
-        <w:rPr>
-          <w:rtl w:val="0"/>
-          <w:lang w:val="pt-PT"/>
-        </w:rPr>
-        <w:t>ô</w:t>
-      </w:r>
-      <w:r>
-        <w:rPr>
-          <w:rtl w:val="0"/>
-          <w:lang w:val="pt-PT"/>
-        </w:rPr>
-        <w:t>mico e de sa</w:t>
-      </w:r>
-      <w:r>
-        <w:rPr>
-          <w:rtl w:val="0"/>
-          <w:lang w:val="pt-PT"/>
-        </w:rPr>
-        <w:t>ú</w:t>
-      </w:r>
-      <w:r>
-        <w:rPr>
-          <w:rtl w:val="0"/>
-          <w:lang w:val="pt-PT"/>
-        </w:rPr>
-        <w:t>de p</w:t>
-      </w:r>
-      <w:r>
-        <w:rPr>
-          <w:rtl w:val="0"/>
-          <w:lang w:val="pt-PT"/>
-        </w:rPr>
-        <w:t>ú</w:t>
-      </w:r>
-      <w:r>
-        <w:rPr>
-          <w:rtl w:val="0"/>
-          <w:lang w:val="pt-PT"/>
-        </w:rPr>
-        <w:t>blica regional. O estado abriga eixos rodovi</w:t>
-      </w:r>
-      <w:r>
-        <w:rPr>
-          <w:rtl w:val="0"/>
-          <w:lang w:val="pt-PT"/>
-        </w:rPr>
-        <w:t>á</w:t>
-      </w:r>
-      <w:r>
-        <w:rPr>
-          <w:rtl w:val="0"/>
-          <w:lang w:val="pt-PT"/>
-        </w:rPr>
-        <w:t>rios estrat</w:t>
-      </w:r>
-      <w:r>
-        <w:rPr>
-          <w:rtl w:val="0"/>
-          <w:lang w:val="pt-PT"/>
-        </w:rPr>
-        <w:t>é</w:t>
-      </w:r>
-      <w:r>
-        <w:rPr>
-          <w:rtl w:val="0"/>
-          <w:lang w:val="pt-PT"/>
-        </w:rPr>
-        <w:t>gicos e de alta densidade de tr</w:t>
-      </w:r>
-      <w:r>
-        <w:rPr>
-          <w:rtl w:val="0"/>
-          <w:lang w:val="pt-PT"/>
-        </w:rPr>
-        <w:t>á</w:t>
-      </w:r>
-      <w:r>
-        <w:rPr>
-          <w:rtl w:val="0"/>
-          <w:lang w:val="pt-PT"/>
-        </w:rPr>
-        <w:t xml:space="preserve">fego, como a BR-101, a BR-470 e a BR-282, frequentemente associados a elevados </w:t>
-      </w:r>
-      <w:r>
-        <w:rPr>
-          <w:rtl w:val="0"/>
-          <w:lang w:val="pt-PT"/>
-        </w:rPr>
-        <w:t>í</w:t>
-      </w:r>
-      <w:r>
-        <w:rPr>
-          <w:rtl w:val="0"/>
-          <w:lang w:val="pt-PT"/>
-        </w:rPr>
-        <w:t>ndices de sinistralidade. Este trabalho apresenta uma abordagem de Aprendizado de M</w:t>
-      </w:r>
-      <w:r>
-        <w:rPr>
-          <w:rtl w:val="0"/>
-          <w:lang w:val="pt-PT"/>
-        </w:rPr>
-        <w:t>á</w:t>
-      </w:r>
-      <w:r>
-        <w:rPr>
-          <w:rtl w:val="0"/>
-          <w:lang w:val="pt-PT"/>
-        </w:rPr>
-        <w:t>quina (Machine Learning - ML) focada na predi</w:t>
-      </w:r>
-      <w:r>
-        <w:rPr>
-          <w:rtl w:val="0"/>
-          <w:lang w:val="pt-PT"/>
-        </w:rPr>
-        <w:t>çã</w:t>
-      </w:r>
-      <w:r>
-        <w:rPr>
-          <w:rtl w:val="0"/>
-          <w:lang w:val="pt-PT"/>
-        </w:rPr>
-        <w:t>o temporal e an</w:t>
-      </w:r>
-      <w:r>
-        <w:rPr>
-          <w:rtl w:val="0"/>
-          <w:lang w:val="pt-PT"/>
-        </w:rPr>
-        <w:t>á</w:t>
-      </w:r>
-      <w:r>
-        <w:rPr>
-          <w:rtl w:val="0"/>
-          <w:lang w:val="pt-PT"/>
-        </w:rPr>
-        <w:t>lise de s</w:t>
-      </w:r>
-      <w:r>
-        <w:rPr>
-          <w:rtl w:val="0"/>
-          <w:lang w:val="pt-PT"/>
-        </w:rPr>
-        <w:t>é</w:t>
-      </w:r>
-      <w:r>
-        <w:rPr>
-          <w:rtl w:val="0"/>
-          <w:lang w:val="pt-PT"/>
-        </w:rPr>
-        <w:t>ries temporais das ocorr</w:t>
-      </w:r>
-      <w:r>
-        <w:rPr>
-          <w:rtl w:val="0"/>
-          <w:lang w:val="pt-PT"/>
-        </w:rPr>
-        <w:t>ê</w:t>
-      </w:r>
-      <w:r>
-        <w:rPr>
-          <w:rtl w:val="0"/>
-          <w:lang w:val="pt-PT"/>
-        </w:rPr>
-        <w:t>ncias registradas pela Pol</w:t>
-      </w:r>
-      <w:r>
-        <w:rPr>
-          <w:rtl w:val="0"/>
-          <w:lang w:val="pt-PT"/>
-        </w:rPr>
-        <w:t>í</w:t>
-      </w:r>
-      <w:r>
-        <w:rPr>
-          <w:rtl w:val="0"/>
-          <w:lang w:val="pt-PT"/>
-        </w:rPr>
-        <w:t>cia Rodovi</w:t>
-      </w:r>
-      <w:r>
-        <w:rPr>
-          <w:rtl w:val="0"/>
-          <w:lang w:val="pt-PT"/>
-        </w:rPr>
-        <w:t>á</w:t>
-      </w:r>
-      <w:r>
-        <w:rPr>
-          <w:rtl w:val="0"/>
-          <w:lang w:val="pt-PT"/>
-        </w:rPr>
-        <w:t>ria Federal (PRF) em territ</w:t>
-      </w:r>
-      <w:r>
-        <w:rPr>
-          <w:rtl w:val="0"/>
-          <w:lang w:val="pt-PT"/>
-        </w:rPr>
-        <w:t>ó</w:t>
-      </w:r>
-      <w:r>
-        <w:rPr>
-          <w:rtl w:val="0"/>
-          <w:lang w:val="pt-PT"/>
-        </w:rPr>
-        <w:t>rio catarinense no per</w:t>
-      </w:r>
-      <w:r>
-        <w:rPr>
-          <w:rtl w:val="0"/>
-          <w:lang w:val="pt-PT"/>
-        </w:rPr>
-        <w:t>í</w:t>
-      </w:r>
-      <w:r>
-        <w:rPr>
-          <w:rtl w:val="0"/>
-          <w:lang w:val="pt-PT"/>
-        </w:rPr>
-        <w:t>odo de 20</w:t>
-      </w:r>
-      <w:r>
-        <w:rPr>
-          <w:rtl w:val="0"/>
-          <w:lang w:val="pt-PT"/>
-        </w:rPr>
-        <w:t>1</w:t>
-      </w:r>
-      <w:r>
-        <w:rPr>
-          <w:rtl w:val="0"/>
-          <w:lang w:val="pt-PT"/>
-        </w:rPr>
-        <w:t>7 a 2026. A partir do tratamento e filtragem dos dados abertos governamentais (UF = 'SC'), busca-se desenvolver modelos preditivos capazes de antecipar a frequ</w:t>
-      </w:r>
-      <w:r>
-        <w:rPr>
-          <w:rtl w:val="0"/>
-          <w:lang w:val="pt-PT"/>
-        </w:rPr>
-        <w:t>ê</w:t>
-      </w:r>
-      <w:r>
-        <w:rPr>
-          <w:rtl w:val="0"/>
-          <w:lang w:val="pt-PT"/>
-        </w:rPr>
-        <w:t>ncia e a severidade dos sinistros em diferentes trechos e intervalos temporais. O estudo abrange todo o ciclo de vida de um projeto de ML de ponta a ponta, apoiando o planejamento operacional preventivo da Superintend</w:t>
-      </w:r>
-      <w:r>
-        <w:rPr>
-          <w:rtl w:val="0"/>
-          <w:lang w:val="pt-PT"/>
-        </w:rPr>
-        <w:t>ê</w:t>
-      </w:r>
-      <w:r>
-        <w:rPr>
-          <w:rtl w:val="0"/>
-          <w:lang w:val="pt-PT"/>
-        </w:rPr>
-        <w:t>ncia da PRF em Santa Catarina.</w:t>
+        <w:t w:space="preserve">Os acidentes de trânsito nas rodovias federais de Santa Catarina representam um grave problema socioeconômico e de saúde pública regional. O estado abriga eixos rodoviários estratégicos e de alta densidade de tráfego, como a BR-101, a BR-470 e a BR-282, frequentemente associados a elevados índices de sinistralidade. Este trabalho apresenta uma abordagem de Aprendizado de Máquina (Machine Learning - ML) focada na predição temporal e análise de séries temporais das ocorrências registradas pela Polícia Rodoviária Federal (PRF) em território catarinense no período de 2017 a 2026. A partir do tratamento e filtragem dos dados abertos governamentais (UF = 'SC'), busca-se desenvolver modelos preditivos capazes de antecipar a frequência dos sinistros em diferentes trechos e intervalos temporais. O estudo abrange todo o ciclo de vida de um projeto de ML de ponta a ponta, apoiando o planejamento operacional preventivo da Superintendência da PRF em Santa Catarina.</w:t>
+      </w:r>
+      <w:r>
+        <w:rPr>
+          <w:rtl w:val="0"/>
+          <w:lang w:val="pt-PT"/>
+        </w:rPr>
+        <w:t/>
+      </w:r>
+      <w:r>
+        <w:rPr>
+          <w:rtl w:val="0"/>
+          <w:lang w:val="pt-PT"/>
+        </w:rPr>
+        <w:t/>
+      </w:r>
+      <w:r>
+        <w:rPr>
+          <w:rtl w:val="0"/>
+          <w:lang w:val="pt-PT"/>
+        </w:rPr>
+        <w:t/>
+      </w:r>
+      <w:r>
+        <w:rPr>
+          <w:rtl w:val="0"/>
+          <w:lang w:val="pt-PT"/>
+        </w:rPr>
+        <w:t/>
+      </w:r>
+      <w:r>
+        <w:rPr>
+          <w:rtl w:val="0"/>
+          <w:lang w:val="pt-PT"/>
+        </w:rPr>
+        <w:t/>
+      </w:r>
+      <w:r>
+        <w:rPr>
+          <w:rtl w:val="0"/>
+          <w:lang w:val="pt-PT"/>
+        </w:rPr>
+        <w:t/>
+      </w:r>
+      <w:r>
+        <w:rPr>
+          <w:rtl w:val="0"/>
+          <w:lang w:val="pt-PT"/>
+        </w:rPr>
+        <w:t/>
+      </w:r>
+      <w:r>
+        <w:rPr>
+          <w:rtl w:val="0"/>
+          <w:lang w:val="pt-PT"/>
+        </w:rPr>
+        <w:t/>
+      </w:r>
+      <w:r>
+        <w:rPr>
+          <w:rtl w:val="0"/>
+          <w:lang w:val="pt-PT"/>
+        </w:rPr>
+        <w:t/>
+      </w:r>
+      <w:r>
+        <w:rPr>
+          <w:rtl w:val="0"/>
+          <w:lang w:val="pt-PT"/>
+        </w:rPr>
+        <w:t/>
+      </w:r>
+      <w:r>
+        <w:rPr>
+          <w:rtl w:val="0"/>
+          <w:lang w:val="pt-PT"/>
+        </w:rPr>
+        <w:t/>
+      </w:r>
+      <w:r>
+        <w:rPr>
+          <w:rtl w:val="0"/>
+          <w:lang w:val="pt-PT"/>
+        </w:rPr>
+        <w:t/>
+      </w:r>
+      <w:r>
+        <w:rPr>
+          <w:rtl w:val="0"/>
+          <w:lang w:val="pt-PT"/>
+        </w:rPr>
+        <w:t/>
+      </w:r>
+      <w:r>
+        <w:rPr>
+          <w:rtl w:val="0"/>
+          <w:lang w:val="pt-PT"/>
+        </w:rPr>
+        <w:t xml:space="preserve"/>
+      </w:r>
+      <w:r>
+        <w:rPr>
+          <w:rtl w:val="0"/>
+          <w:lang w:val="pt-PT"/>
+        </w:rPr>
+        <w:t/>
+      </w:r>
+      <w:r>
+        <w:rPr>
+          <w:rtl w:val="0"/>
+          <w:lang w:val="pt-PT"/>
+        </w:rPr>
+        <w:t/>
+      </w:r>
+      <w:r>
+        <w:rPr>
+          <w:rtl w:val="0"/>
+          <w:lang w:val="pt-PT"/>
+        </w:rPr>
+        <w:t/>
+      </w:r>
+      <w:r>
+        <w:rPr>
+          <w:rtl w:val="0"/>
+          <w:lang w:val="pt-PT"/>
+        </w:rPr>
+        <w:t/>
+      </w:r>
+      <w:r>
+        <w:rPr>
+          <w:rtl w:val="0"/>
+          <w:lang w:val="pt-PT"/>
+        </w:rPr>
+        <w:t/>
+      </w:r>
+      <w:r>
+        <w:rPr>
+          <w:rtl w:val="0"/>
+          <w:lang w:val="pt-PT"/>
+        </w:rPr>
+        <w:t/>
+      </w:r>
+      <w:r>
+        <w:rPr>
+          <w:rtl w:val="0"/>
+          <w:lang w:val="pt-PT"/>
+        </w:rPr>
+        <w:t/>
+      </w:r>
+      <w:r>
+        <w:rPr>
+          <w:rtl w:val="0"/>
+          <w:lang w:val="pt-PT"/>
+        </w:rPr>
+        <w:t/>
+      </w:r>
+      <w:r>
+        <w:rPr>
+          <w:rtl w:val="0"/>
+          <w:lang w:val="pt-PT"/>
+        </w:rPr>
+        <w:t/>
+      </w:r>
+      <w:r>
+        <w:rPr>
+          <w:rtl w:val="0"/>
+          <w:lang w:val="pt-PT"/>
+        </w:rPr>
+        <w:t/>
+      </w:r>
+      <w:r>
+        <w:rPr>
+          <w:rtl w:val="0"/>
+          <w:lang w:val="pt-PT"/>
+        </w:rPr>
+        <w:t/>
+      </w:r>
+      <w:r>
+        <w:rPr>
+          <w:rtl w:val="0"/>
+          <w:lang w:val="pt-PT"/>
+        </w:rPr>
+        <w:t/>
+      </w:r>
+      <w:r>
+        <w:rPr>
+          <w:rtl w:val="0"/>
+          <w:lang w:val="pt-PT"/>
+        </w:rPr>
+        <w:t/>
+      </w:r>
+      <w:r>
+        <w:rPr>
+          <w:rtl w:val="0"/>
+          <w:lang w:val="pt-PT"/>
+        </w:rPr>
+        <w:t/>
+      </w:r>
+      <w:r>
+        <w:rPr>
+          <w:rtl w:val="0"/>
+          <w:lang w:val="pt-PT"/>
+        </w:rPr>
+        <w:t/>
+      </w:r>
+      <w:r>
+        <w:rPr>
+          <w:rtl w:val="0"/>
+          <w:lang w:val="pt-PT"/>
+        </w:rPr>
+        <w:t/>
+      </w:r>
+      <w:r>
+        <w:rPr>
+          <w:rtl w:val="0"/>
+          <w:lang w:val="pt-PT"/>
+        </w:rPr>
+        <w:t/>
+      </w:r>
+      <w:r>
+        <w:rPr>
+          <w:rtl w:val="0"/>
+          <w:lang w:val="pt-PT"/>
+        </w:rPr>
+        <w:t/>
+      </w:r>
+      <w:r>
+        <w:rPr>
+          <w:rtl w:val="0"/>
+          <w:lang w:val="pt-PT"/>
+        </w:rPr>
+        <w:t/>
+      </w:r>
+      <w:r>
+        <w:rPr>
+          <w:rtl w:val="0"/>
+          <w:lang w:val="pt-PT"/>
+        </w:rPr>
+        <w:t/>
+      </w:r>
+      <w:r>
+        <w:rPr>
+          <w:rtl w:val="0"/>
+          <w:lang w:val="pt-PT"/>
+        </w:rPr>
+        <w:t/>
+      </w:r>
+      <w:r>
+        <w:rPr>
+          <w:rtl w:val="0"/>
+          <w:lang w:val="pt-PT"/>
+        </w:rPr>
+        <w:t/>
+      </w:r>
+      <w:r>
+        <w:rPr>
+          <w:rtl w:val="0"/>
+          <w:lang w:val="pt-PT"/>
+        </w:rPr>
+        <w:t/>
+      </w:r>
+      <w:r>
+        <w:rPr>
+          <w:rtl w:val="0"/>
+          <w:lang w:val="pt-PT"/>
+        </w:rPr>
+        <w:t/>
+      </w:r>
+      <w:r>
+        <w:rPr>
+          <w:rtl w:val="0"/>
+          <w:lang w:val="pt-PT"/>
+        </w:rPr>
+        <w:t/>
+      </w:r>
+      <w:r>
+        <w:rPr>
+          <w:rtl w:val="0"/>
+          <w:lang w:val="pt-PT"/>
+        </w:rPr>
+        <w:t/>
       </w:r>
     </w:p>
     <w:p>
@@ -618,35 +618,35 @@
           <w:rtl w:val="0"/>
           <w:lang w:val="pt-PT"/>
         </w:rPr>
-        <w:t>Traffic accidents on federal highways in the state of Santa Catarina represent a major regional socioeconomic and public health challenge. Santa Catarina connects vital port and tourist corridors</w:t>
-      </w:r>
-      <w:r>
-        <w:rPr>
-          <w:rtl w:val="0"/>
-          <w:lang w:val="pt-PT"/>
-        </w:rPr>
-        <w:t>—</w:t>
-      </w:r>
-      <w:r>
-        <w:rPr>
-          <w:rtl w:val="0"/>
-          <w:lang w:val="pt-PT"/>
-        </w:rPr>
-        <w:t>such as BR-101, BR-470, and BR-282</w:t>
-      </w:r>
-      <w:r>
-        <w:rPr>
-          <w:rtl w:val="0"/>
-          <w:lang w:val="pt-PT"/>
-        </w:rPr>
-        <w:t>—</w:t>
-      </w:r>
-      <w:r>
-        <w:rPr>
-          <w:rtl w:val="0"/>
-          <w:lang w:val="pt-PT"/>
-        </w:rPr>
-        <w:t>which systematically record high accident rates. This study presents a Machine Learning (ML) approach focused on time-series forecasting and temporal analysis of traffic occurrences recorded by the Federal Highway Police (PRF) in Santa Catarina from 2007 to 2026. By processing and filtering open government data for Santa Catarina, the project aims to develop predictive models to forecast crash frequency and severity across critical highway segments and temporal windows. The research covers the full end-to-end ML lifecycle, supporting preventive enforcement and resource allocation for public safety.</w:t>
+        <w:t w:space="preserve">Traffic accidents on federal highways in the state of Santa Catarina represent a major regional socioeconomic and public health challenge. Santa Catarina connects vital port and tourist corridors—such as BR-101, BR-470, and BR-282—which systematically record high accident rates. This study presents a Machine Learning (ML) approach focused on time-series forecasting and temporal analysis of traffic occurrences recorded by the Federal Highway Police (PRF) in Santa Catarina from 2017 to 2026. By processing and filtering open government data for Santa Catarina, the project aims to develop predictive models to forecast crash frequency across critical highway segments and temporal windows. The research covers the full end-to-end ML lifecycle, supporting preventive enforcement and resource allocation for public safety.</w:t>
+      </w:r>
+      <w:r>
+        <w:rPr>
+          <w:rtl w:val="0"/>
+          <w:lang w:val="pt-PT"/>
+        </w:rPr>
+        <w:t/>
+      </w:r>
+      <w:r>
+        <w:rPr>
+          <w:rtl w:val="0"/>
+          <w:lang w:val="pt-PT"/>
+        </w:rPr>
+        <w:t/>
+      </w:r>
+      <w:r>
+        <w:rPr>
+          <w:rtl w:val="0"/>
+          <w:lang w:val="pt-PT"/>
+        </w:rPr>
+        <w:t/>
+      </w:r>
+      <w:r>
+        <w:rPr>
+          <w:rtl w:val="0"/>
+          <w:lang w:val="pt-PT"/>
+        </w:rPr>
+        <w:t/>
       </w:r>
     </w:p>
     <w:p>
@@ -4129,10 +4129,10 @@
       </w:r>
     </w:p>
     <w:sectPr>
-      <w:headerReference w:type="default" r:id="rId4"/>
-      <w:headerReference w:type="first" r:id="rId5"/>
-      <w:footerReference w:type="default" r:id="rId6"/>
-      <w:footerReference w:type="first" r:id="rId7"/>
+      <w:headerReference w:type="default" ns2:id="rId4"/>
+      <w:headerReference w:type="first" ns2:id="rId5"/>
+      <w:footerReference w:type="default" ns2:id="rId6"/>
+      <w:footerReference w:type="first" ns2:id="rId7"/>
       <w:pgSz w:w="11900" w:h="16840" w:orient="portrait"/>
       <w:pgMar w:top="1701" w:right="1134" w:bottom="1134" w:left="1701" w:header="709" w:footer="709"/>
       <w:titlePg w:val="1"/>

</xml_diff>